<commit_message>
Update price tag printing and import history
</commit_message>
<xml_diff>
--- a/public/templates/pricetag/disc-reg-kcl.docx
+++ b/public/templates/pricetag/disc-reg-kcl.docx
@@ -49,12 +49,26 @@
             <w10:wrap type="square"/>
           </v:shape>
         </w:pict>
+      </w:r>
+      <w:r>
+        <w:rPr>
+          <w:b/>
+          <w:noProof/>
+          <w:lang w:val="en-US"/>
+        </w:rPr>
         <w:pict>
           <v:shape id="_x0000_s1108" type="#_x0000_t136" style="position:absolute;margin-left:78.4pt;margin-top:-99pt;width:72.15pt;height:9pt;z-index:251683840" fillcolor="black [3213]" stroked="f" strokecolor="#002060" strokeweight="1.5pt">
             <v:shadow color="#900"/>
             <v:textpath style="font-family:&quot;Arial Narrow&quot;;v-text-kern:t" trim="t" fitpath="t" string="JUMLAH POP : 1"/>
           </v:shape>
         </w:pict>
+      </w:r>
+      <w:r>
+        <w:rPr>
+          <w:b/>
+          <w:noProof/>
+          <w:lang w:val="en-US"/>
+        </w:rPr>
         <w:pict>
           <v:shape id="_x0000_s1081" type="#_x0000_t136" style="position:absolute;margin-left:55pt;margin-top:-54pt;width:143pt;height:18pt;z-index:251658240" fillcolor="#00b0f0" strokecolor="black [3213]" strokeweight=".25pt">
             <v:shadow color="#900"/>
@@ -71,19 +85,35 @@
           <w:lang w:val="en-US"/>
         </w:rPr>
         <w:pict>
-          <v:shape id="_x0000_s1094" type="#_x0000_t136" style="position:absolute;margin-left:65.9pt;margin-top:-9pt;width:126.5pt;height:46.7pt;z-index:251671552" fillcolor="red" strokecolor="red" strokeweight="3pt">
+          <v:shape id="_x0000_s1094" type="#_x0000_t136" style="position:absolute;margin-left:62.5pt;margin-top:-9pt;width:126.5pt;height:46.7pt;z-index:251671552" fillcolor="red" strokecolor="red" strokeweight="3pt">
             <v:shadow color="#900"/>
             <v:textpath style="font-family:&quot;Book Antiqua&quot;;font-weight:bold;v-text-kern:t" trim="t" fitpath="t" string="&lt;&lt;Program&gt;&gt;"/>
           </v:shape>
         </w:pict>
-        <w:pict>
-          <v:shape id="_x0000_s1095" type="#_x0000_t136" style="position:absolute;margin-left:197.9pt;margin-top:-9pt;width:16.5pt;height:18pt;z-index:251672576" fillcolor="red" strokecolor="red" strokeweight="1.5pt">
+      </w:r>
+      <w:r>
+        <w:rPr>
+          <w:b/>
+          <w:noProof/>
+          <w:color w:val="FF0000"/>
+          <w:lang w:val="en-US"/>
+        </w:rPr>
+        <w:pict>
+          <v:shape id="_x0000_s1095" type="#_x0000_t136" style="position:absolute;margin-left:195.5pt;margin-top:-9pt;width:16.5pt;height:18pt;z-index:251672576" fillcolor="red" strokecolor="red" strokeweight="1.5pt">
             <v:shadow color="#900"/>
             <v:textpath style="font-family:&quot;Arial Narrow&quot;;v-text-kern:t" trim="t" fitpath="t" string="%"/>
           </v:shape>
         </w:pict>
-        <w:pict>
-          <v:shape id="_x0000_s1096" type="#_x0000_t136" style="position:absolute;margin-left:3.8pt;margin-top:-9pt;width:56.6pt;height:11.3pt;z-index:251673600" fillcolor="red" stroked="f" strokecolor="red" strokeweight="1.5pt">
+      </w:r>
+      <w:r>
+        <w:rPr>
+          <w:b/>
+          <w:noProof/>
+          <w:color w:val="FF0000"/>
+          <w:lang w:val="en-US"/>
+        </w:rPr>
+        <w:pict>
+          <v:shape id="_x0000_s1096" type="#_x0000_t136" style="position:absolute;margin-left:-.6pt;margin-top:-9pt;width:56.6pt;height:11.3pt;z-index:251673600" fillcolor="red" stroked="f" strokecolor="red" strokeweight="1.5pt">
             <v:shadow color="#900"/>
             <v:textpath style="font-family:&quot;Book Antiqua&quot;;font-size:20pt;font-weight:bold;v-text-kern:t" trim="t" fitpath="t" string="Diskon :"/>
           </v:shape>
@@ -96,7 +126,7 @@
           <w:lang w:val="en-US"/>
         </w:rPr>
         <w:pict>
-          <v:shape id="_x0000_s1098" type="#_x0000_t136" style="position:absolute;margin-left:-.1pt;margin-top:41.7pt;width:55.1pt;height:9pt;z-index:251674624" fillcolor="black [3213]" stroked="f" strokecolor="#002060" strokeweight="1.5pt">
+          <v:shape id="_x0000_s1098" type="#_x0000_t136" style="position:absolute;margin-left:-.1pt;margin-top:19.7pt;width:55.1pt;height:9pt;z-index:251674624" fillcolor="black [3213]" stroked="f" strokecolor="#002060" strokeweight="1.5pt">
             <v:shadow color="#900"/>
             <v:textpath style="font-family:&quot;Century Gothic&quot;;font-style:italic;v-text-kern:t" trim="t" fitpath="t" string="( PLU : &lt;&lt;PLU&gt;&gt; )"/>
             <w10:wrap type="square"/>
@@ -114,7 +144,42 @@
           <w:b/>
           <w:i/>
         </w:rPr>
-        <w:t xml:space="preserve">                     </w:t>
+        <w:t xml:space="preserve">             </w:t>
+      </w:r>
+      <w:r>
+        <w:rPr>
+          <w:b/>
+          <w:i/>
+        </w:rPr>
+        <w:t xml:space="preserve"> </w:t>
+      </w:r>
+      <w:r>
+        <w:rPr>
+          <w:b/>
+          <w:i/>
+        </w:rPr>
+        <w:t xml:space="preserve"> </w:t>
+      </w:r>
+      <w:r>
+        <w:rPr>
+          <w:b/>
+          <w:i/>
+        </w:rPr>
+        <w:t xml:space="preserve">    </w:t>
+      </w:r>
+      <w:r>
+        <w:rPr>
+          <w:b/>
+          <w:i/>
+        </w:rPr>
+        <w:t xml:space="preserve"> </w:t>
+      </w:r>
+      <w:r>
+        <w:rPr>
+          <w:b/>
+          <w:i/>
+        </w:rPr>
+        <w:t xml:space="preserve"> </w:t>
       </w:r>
     </w:p>
     <w:p>
@@ -135,13 +200,21 @@
           <w:lang w:val="en-US"/>
         </w:rPr>
         <w:pict>
-          <v:shape id="_x0000_s1102" type="#_x0000_t136" style="position:absolute;margin-left:95.5pt;margin-top:44.95pt;width:60.5pt;height:16.3pt;z-index:251678720" fillcolor="red" stroked="f" strokecolor="red" strokeweight="1.5pt">
+          <v:shape id="_x0000_s1102" type="#_x0000_t136" style="position:absolute;margin-left:95.5pt;margin-top:22.95pt;width:60.5pt;height:16.3pt;z-index:251678720" fillcolor="red" stroked="f" strokecolor="red" strokeweight="1.5pt">
             <v:shadow color="#900"/>
             <v:textpath style="font-family:&quot;Book Antiqua&quot;;font-weight:bold;v-text-kern:t" trim="t" fitpath="t" string="&lt;&lt;HargaPromo&gt;&gt;"/>
           </v:shape>
         </w:pict>
-        <w:pict>
-          <v:shape id="_x0000_s1101" type="#_x0000_t136" style="position:absolute;margin-left:7.5pt;margin-top:43.25pt;width:44pt;height:16.3pt;z-index:251677696" fillcolor="red" stroked="f" strokecolor="red" strokeweight="1.5pt">
+      </w:r>
+      <w:r>
+        <w:rPr>
+          <w:b/>
+          <w:noProof/>
+          <w:color w:val="FF0000"/>
+          <w:lang w:val="en-US"/>
+        </w:rPr>
+        <w:pict>
+          <v:shape id="_x0000_s1101" type="#_x0000_t136" style="position:absolute;margin-left:7.5pt;margin-top:21.25pt;width:44pt;height:16.3pt;z-index:251677696" fillcolor="red" stroked="f" strokecolor="red" strokeweight="1.5pt">
             <v:shadow color="#900"/>
             <v:textpath style="font-family:&quot;Book Antiqua&quot;;font-weight:bold;v-text-kern:t" trim="t" fitpath="t" string="&lt;&lt;HargaNormal&gt;&gt;"/>
           </v:shape>
@@ -154,13 +227,20 @@
           <w:lang w:val="en-US"/>
         </w:rPr>
         <w:pict>
-          <v:shape id="_x0000_s1107" type="#_x0000_t136" style="position:absolute;margin-left:-9.6pt;margin-top:43.25pt;width:10.4pt;height:9pt;z-index:251682816" fillcolor="red" stroked="f" strokecolor="red" strokeweight="1.5pt">
+          <v:shape id="_x0000_s1107" type="#_x0000_t136" style="position:absolute;margin-left:-9.6pt;margin-top:21.25pt;width:10.4pt;height:9pt;z-index:251682816" fillcolor="red" stroked="f" strokecolor="red" strokeweight="1.5pt">
             <v:shadow color="#900"/>
             <v:textpath style="font-family:&quot;Calisto MT&quot;;v-text-kern:t" trim="t" fitpath="t" string="Rp"/>
           </v:shape>
         </w:pict>
-        <w:pict>
-          <v:shape id="_x0000_s1106" type="#_x0000_t136" style="position:absolute;margin-left:78.4pt;margin-top:41.55pt;width:10.4pt;height:9pt;z-index:251681792" fillcolor="red" stroked="f" strokecolor="red" strokeweight="1.5pt">
+      </w:r>
+      <w:r>
+        <w:rPr>
+          <w:noProof/>
+          <w:color w:val="FF0000"/>
+          <w:lang w:val="en-US"/>
+        </w:rPr>
+        <w:pict>
+          <v:shape id="_x0000_s1106" type="#_x0000_t136" style="position:absolute;margin-left:78.4pt;margin-top:19.55pt;width:10.4pt;height:9pt;z-index:251681792" fillcolor="red" stroked="f" strokecolor="red" strokeweight="1.5pt">
             <v:shadow color="#900"/>
             <v:textpath style="font-family:&quot;Calisto MT&quot;;v-text-kern:t" trim="t" fitpath="t" string="Rp"/>
           </v:shape>
@@ -190,7 +270,7 @@
               <v:h position="#0,#1" xrange="0,21600" yrange="0,10800"/>
             </v:handles>
           </v:shapetype>
-          <v:shape id="_x0000_s1105" type="#_x0000_t13" style="position:absolute;margin-left:68pt;margin-top:50.55pt;width:10.4pt;height:9pt;z-index:251680768"/>
+          <v:shape id="_x0000_s1105" type="#_x0000_t13" style="position:absolute;margin-left:68pt;margin-top:28.55pt;width:10.4pt;height:9pt;z-index:251680768"/>
         </w:pict>
       </w:r>
       <w:r>
@@ -200,9 +280,9 @@
           <w:lang w:val="en-US"/>
         </w:rPr>
         <w:pict>
-          <v:shape id="_x0000_s1089" type="#_x0000_t136" style="position:absolute;margin-left:-64.1pt;margin-top:34.25pt;width:49pt;height:27pt;z-index:251666432" fillcolor="black [3213]" stroked="f" strokecolor="#002060" strokeweight="1.5pt">
+          <v:shape id="_x0000_s1089" type="#_x0000_t136" style="position:absolute;margin-left:-64.1pt;margin-top:12.25pt;width:49pt;height:27pt;z-index:251666432" fillcolor="black [3213]" stroked="f" strokecolor="#002060" strokeweight="1.5pt">
             <v:shadow color="#900"/>
-            <v:textpath style="font-family:&quot;Century Gothic&quot;;font-weight:bold;v-text-kern:t" trim="t" fitpath="t" string="Akhir Periode : &lt;&lt;Periode&gt;&gt;"/>
+            <v:textpath style="font-family:&quot;Century Gothic&quot;;font-weight:bold;v-text-kern:t" trim="t" fitpath="t" string="Akhir Periode :&#10;&lt;&lt;Periode&gt;&gt;"/>
             <w10:wrap type="square"/>
           </v:shape>
         </w:pict>
@@ -219,11 +299,13 @@
             <v:path arrowok="t" fillok="f" o:connecttype="none"/>
             <o:lock v:ext="edit" shapetype="t"/>
           </v:shapetype>
-          <v:shape id="_x0000_s1103" type="#_x0000_t32" style="position:absolute;margin-left:-5.5pt;margin-top:52.25pt;width:68pt;height:7.3pt;flip:y;z-index:251679744" o:connectortype="straight" strokeweight="1pt"/>
+          <v:shape id="_x0000_s1103" type="#_x0000_t32" style="position:absolute;margin-left:-5.5pt;margin-top:30.25pt;width:68pt;height:7.3pt;flip:y;z-index:251679744" o:connectortype="straight" strokeweight="1pt"/>
         </w:pict>
       </w:r>
       <w:r>
         <w:t xml:space="preserve"> </w:t>
+      </w:r>
+      <w:r>
         <w:tab/>
       </w:r>
     </w:p>

</xml_diff>

<commit_message>
Add history import page and detail import
</commit_message>
<xml_diff>
--- a/public/templates/pricetag/disc-reg-kcl.docx
+++ b/public/templates/pricetag/disc-reg-kcl.docx
@@ -85,7 +85,7 @@
           <w:lang w:val="en-US"/>
         </w:rPr>
         <w:pict>
-          <v:shape id="_x0000_s1094" type="#_x0000_t136" style="position:absolute;margin-left:62.5pt;margin-top:-9pt;width:126.5pt;height:46.7pt;z-index:251671552" fillcolor="red" strokecolor="red" strokeweight="3pt">
+          <v:shape id="_x0000_s1094" type="#_x0000_t136" style="position:absolute;margin-left:-3.5pt;margin-top:-9pt;width:126.5pt;height:46.7pt;z-index:251671552" fillcolor="red" strokecolor="red" strokeweight="3pt">
             <v:shadow color="#900"/>
             <v:textpath style="font-family:&quot;Book Antiqua&quot;;font-weight:bold;v-text-kern:t" trim="t" fitpath="t" string="&lt;&lt;Program&gt;&gt;"/>
           </v:shape>
@@ -99,7 +99,7 @@
           <w:lang w:val="en-US"/>
         </w:rPr>
         <w:pict>
-          <v:shape id="_x0000_s1095" type="#_x0000_t136" style="position:absolute;margin-left:195.5pt;margin-top:-9pt;width:16.5pt;height:18pt;z-index:251672576" fillcolor="red" strokecolor="red" strokeweight="1.5pt">
+          <v:shape id="_x0000_s1095" type="#_x0000_t136" style="position:absolute;margin-left:128.5pt;margin-top:-9pt;width:16.5pt;height:18pt;z-index:251672576" fillcolor="red" strokecolor="red" strokeweight="1.5pt">
             <v:shadow color="#900"/>
             <v:textpath style="font-family:&quot;Arial Narrow&quot;;v-text-kern:t" trim="t" fitpath="t" string="%"/>
           </v:shape>
@@ -113,7 +113,7 @@
           <w:lang w:val="en-US"/>
         </w:rPr>
         <w:pict>
-          <v:shape id="_x0000_s1096" type="#_x0000_t136" style="position:absolute;margin-left:-.6pt;margin-top:-9pt;width:56.6pt;height:11.3pt;z-index:251673600" fillcolor="red" stroked="f" strokecolor="red" strokeweight="1.5pt">
+          <v:shape id="_x0000_s1096" type="#_x0000_t136" style="position:absolute;margin-left:-65.6pt;margin-top:-9pt;width:56.6pt;height:11.3pt;z-index:251673600" fillcolor="red" stroked="f" strokecolor="red" strokeweight="1.5pt">
             <v:shadow color="#900"/>
             <v:textpath style="font-family:&quot;Book Antiqua&quot;;font-size:20pt;font-weight:bold;v-text-kern:t" trim="t" fitpath="t" string="Diskon :"/>
           </v:shape>

</xml_diff>

<commit_message>
Remove 'brand' field from PriceTag model, views, and templates; add migration to drop 'brand' column from price_tags table
</commit_message>
<xml_diff>
--- a/public/templates/pricetag/disc-reg-kcl.docx
+++ b/public/templates/pricetag/disc-reg-kcl.docx
@@ -85,7 +85,7 @@
           <w:lang w:val="en-US"/>
         </w:rPr>
         <w:pict>
-          <v:shape id="_x0000_s1094" type="#_x0000_t136" style="position:absolute;margin-left:-3.5pt;margin-top:-9pt;width:126.5pt;height:46.7pt;z-index:251671552" fillcolor="red" strokecolor="red" strokeweight="3pt">
+          <v:shape id="_x0000_s1094" type="#_x0000_t136" style="position:absolute;margin-left:62.5pt;margin-top:-9pt;width:126.5pt;height:46.7pt;z-index:251671552" fillcolor="red" strokecolor="red" strokeweight="3pt">
             <v:shadow color="#900"/>
             <v:textpath style="font-family:&quot;Book Antiqua&quot;;font-weight:bold;v-text-kern:t" trim="t" fitpath="t" string="&lt;&lt;Program&gt;&gt;"/>
           </v:shape>
@@ -99,7 +99,7 @@
           <w:lang w:val="en-US"/>
         </w:rPr>
         <w:pict>
-          <v:shape id="_x0000_s1095" type="#_x0000_t136" style="position:absolute;margin-left:128.5pt;margin-top:-9pt;width:16.5pt;height:18pt;z-index:251672576" fillcolor="red" strokecolor="red" strokeweight="1.5pt">
+          <v:shape id="_x0000_s1095" type="#_x0000_t136" style="position:absolute;margin-left:195.5pt;margin-top:-9pt;width:16.5pt;height:18pt;z-index:251672576" fillcolor="red" strokecolor="red" strokeweight="1.5pt">
             <v:shadow color="#900"/>
             <v:textpath style="font-family:&quot;Arial Narrow&quot;;v-text-kern:t" trim="t" fitpath="t" string="%"/>
           </v:shape>
@@ -113,7 +113,7 @@
           <w:lang w:val="en-US"/>
         </w:rPr>
         <w:pict>
-          <v:shape id="_x0000_s1096" type="#_x0000_t136" style="position:absolute;margin-left:-65.6pt;margin-top:-9pt;width:56.6pt;height:11.3pt;z-index:251673600" fillcolor="red" stroked="f" strokecolor="red" strokeweight="1.5pt">
+          <v:shape id="_x0000_s1096" type="#_x0000_t136" style="position:absolute;margin-left:-.6pt;margin-top:-9pt;width:56.6pt;height:11.3pt;z-index:251673600" fillcolor="red" stroked="f" strokecolor="red" strokeweight="1.5pt">
             <v:shadow color="#900"/>
             <v:textpath style="font-family:&quot;Book Antiqua&quot;;font-size:20pt;font-weight:bold;v-text-kern:t" trim="t" fitpath="t" string="Diskon :"/>
           </v:shape>

</xml_diff>